<commit_message>
chore: regenerate docx fixtures after boolean serialization refactor
</commit_message>
<xml_diff>
--- a/examples/generated/complex_tables.docx
+++ b/examples/generated/complex_tables.docx
@@ -253,7 +253,7 @@
           </w:tcPr>
           <w:p>
             <w:r>
-              <w:t>101K</w:t>
+              <w:t>381K</w:t>
             </w:r>
           </w:p>
         </w:tc>
@@ -263,7 +263,7 @@
           </w:tcPr>
           <w:p>
             <w:r>
-              <w:t>173K</w:t>
+              <w:t>223K</w:t>
             </w:r>
           </w:p>
         </w:tc>
@@ -273,7 +273,7 @@
           </w:tcPr>
           <w:p>
             <w:r>
-              <w:t>441K</w:t>
+              <w:t>126K</w:t>
             </w:r>
           </w:p>
         </w:tc>
@@ -283,7 +283,7 @@
           </w:tcPr>
           <w:p>
             <w:r>
-              <w:t>375K</w:t>
+              <w:t>279K</w:t>
             </w:r>
           </w:p>
         </w:tc>
@@ -305,7 +305,7 @@
           </w:tcPr>
           <w:p>
             <w:r>
-              <w:t>219K</w:t>
+              <w:t>205K</w:t>
             </w:r>
           </w:p>
         </w:tc>
@@ -315,7 +315,7 @@
           </w:tcPr>
           <w:p>
             <w:r>
-              <w:t>328K</w:t>
+              <w:t>407K</w:t>
             </w:r>
           </w:p>
         </w:tc>
@@ -325,7 +325,7 @@
           </w:tcPr>
           <w:p>
             <w:r>
-              <w:t>179K</w:t>
+              <w:t>285K</w:t>
             </w:r>
           </w:p>
         </w:tc>
@@ -335,7 +335,7 @@
           </w:tcPr>
           <w:p>
             <w:r>
-              <w:t>218K</w:t>
+              <w:t>388K</w:t>
             </w:r>
           </w:p>
         </w:tc>
@@ -357,37 +357,37 @@
           </w:tcPr>
           <w:p>
             <w:r>
+              <w:t>214K</w:t>
+            </w:r>
+          </w:p>
+        </w:tc>
+        <w:tc>
+          <w:tcPr>
+            <w:shd w:val="clear" w:fill="F2F2F2"/>
+          </w:tcPr>
+          <w:p>
+            <w:r>
+              <w:t>409K</w:t>
+            </w:r>
+          </w:p>
+        </w:tc>
+        <w:tc>
+          <w:tcPr>
+            <w:shd w:val="clear" w:fill="F2F2F2"/>
+          </w:tcPr>
+          <w:p>
+            <w:r>
+              <w:t>145K</w:t>
+            </w:r>
+          </w:p>
+        </w:tc>
+        <w:tc>
+          <w:tcPr>
+            <w:shd w:val="clear" w:fill="F2F2F2"/>
+          </w:tcPr>
+          <w:p>
+            <w:r>
               <w:t>172K</w:t>
-            </w:r>
-          </w:p>
-        </w:tc>
-        <w:tc>
-          <w:tcPr>
-            <w:shd w:val="clear" w:fill="F2F2F2"/>
-          </w:tcPr>
-          <w:p>
-            <w:r>
-              <w:t>298K</w:t>
-            </w:r>
-          </w:p>
-        </w:tc>
-        <w:tc>
-          <w:tcPr>
-            <w:shd w:val="clear" w:fill="F2F2F2"/>
-          </w:tcPr>
-          <w:p>
-            <w:r>
-              <w:t>302K</w:t>
-            </w:r>
-          </w:p>
-        </w:tc>
-        <w:tc>
-          <w:tcPr>
-            <w:shd w:val="clear" w:fill="F2F2F2"/>
-          </w:tcPr>
-          <w:p>
-            <w:r>
-              <w:t>428K</w:t>
             </w:r>
           </w:p>
         </w:tc>
@@ -409,7 +409,7 @@
           </w:tcPr>
           <w:p>
             <w:r>
-              <w:t>465K</w:t>
+              <w:t>356K</w:t>
             </w:r>
           </w:p>
         </w:tc>
@@ -419,7 +419,7 @@
           </w:tcPr>
           <w:p>
             <w:r>
-              <w:t>375K</w:t>
+              <w:t>168K</w:t>
             </w:r>
           </w:p>
         </w:tc>
@@ -429,7 +429,7 @@
           </w:tcPr>
           <w:p>
             <w:r>
-              <w:t>488K</w:t>
+              <w:t>162K</w:t>
             </w:r>
           </w:p>
         </w:tc>
@@ -439,7 +439,7 @@
           </w:tcPr>
           <w:p>
             <w:r>
-              <w:t>344K</w:t>
+              <w:t>189K</w:t>
             </w:r>
           </w:p>
         </w:tc>

</xml_diff>

<commit_message>
chore: regenerate example DOCX files with improved settings/compat output
</commit_message>
<xml_diff>
--- a/examples/generated/complex_tables.docx
+++ b/examples/generated/complex_tables.docx
@@ -253,7 +253,7 @@
           </w:tcPr>
           <w:p>
             <w:r>
-              <w:t>381K</w:t>
+              <w:t>181K</w:t>
             </w:r>
           </w:p>
         </w:tc>
@@ -263,7 +263,7 @@
           </w:tcPr>
           <w:p>
             <w:r>
-              <w:t>223K</w:t>
+              <w:t>347K</w:t>
             </w:r>
           </w:p>
         </w:tc>
@@ -273,7 +273,7 @@
           </w:tcPr>
           <w:p>
             <w:r>
-              <w:t>126K</w:t>
+              <w:t>495K</w:t>
             </w:r>
           </w:p>
         </w:tc>
@@ -283,7 +283,7 @@
           </w:tcPr>
           <w:p>
             <w:r>
-              <w:t>279K</w:t>
+              <w:t>218K</w:t>
             </w:r>
           </w:p>
         </w:tc>
@@ -305,7 +305,7 @@
           </w:tcPr>
           <w:p>
             <w:r>
-              <w:t>205K</w:t>
+              <w:t>322K</w:t>
             </w:r>
           </w:p>
         </w:tc>
@@ -315,7 +315,7 @@
           </w:tcPr>
           <w:p>
             <w:r>
-              <w:t>407K</w:t>
+              <w:t>193K</w:t>
             </w:r>
           </w:p>
         </w:tc>
@@ -325,7 +325,7 @@
           </w:tcPr>
           <w:p>
             <w:r>
-              <w:t>285K</w:t>
+              <w:t>149K</w:t>
             </w:r>
           </w:p>
         </w:tc>
@@ -335,7 +335,7 @@
           </w:tcPr>
           <w:p>
             <w:r>
-              <w:t>388K</w:t>
+              <w:t>477K</w:t>
             </w:r>
           </w:p>
         </w:tc>
@@ -357,7 +357,7 @@
           </w:tcPr>
           <w:p>
             <w:r>
-              <w:t>214K</w:t>
+              <w:t>256K</w:t>
             </w:r>
           </w:p>
         </w:tc>
@@ -367,7 +367,7 @@
           </w:tcPr>
           <w:p>
             <w:r>
-              <w:t>409K</w:t>
+              <w:t>176K</w:t>
             </w:r>
           </w:p>
         </w:tc>
@@ -377,7 +377,7 @@
           </w:tcPr>
           <w:p>
             <w:r>
-              <w:t>145K</w:t>
+              <w:t>491K</w:t>
             </w:r>
           </w:p>
         </w:tc>
@@ -387,7 +387,7 @@
           </w:tcPr>
           <w:p>
             <w:r>
-              <w:t>172K</w:t>
+              <w:t>309K</w:t>
             </w:r>
           </w:p>
         </w:tc>
@@ -409,7 +409,7 @@
           </w:tcPr>
           <w:p>
             <w:r>
-              <w:t>356K</w:t>
+              <w:t>496K</w:t>
             </w:r>
           </w:p>
         </w:tc>
@@ -419,7 +419,7 @@
           </w:tcPr>
           <w:p>
             <w:r>
-              <w:t>168K</w:t>
+              <w:t>481K</w:t>
             </w:r>
           </w:p>
         </w:tc>
@@ -429,7 +429,7 @@
           </w:tcPr>
           <w:p>
             <w:r>
-              <w:t>162K</w:t>
+              <w:t>458K</w:t>
             </w:r>
           </w:p>
         </w:tc>
@@ -439,7 +439,7 @@
           </w:tcPr>
           <w:p>
             <w:r>
-              <w:t>189K</w:t>
+              <w:t>217K</w:t>
             </w:r>
           </w:p>
         </w:tc>

</xml_diff>

<commit_message>
chore: update generated DOCX fixtures after footnote type fix
Regular footnotes no longer have invalid w:type='normal' attribute.
</commit_message>
<xml_diff>
--- a/examples/generated/complex_tables.docx
+++ b/examples/generated/complex_tables.docx
@@ -253,7 +253,7 @@
           </w:tcPr>
           <w:p>
             <w:r>
-              <w:t>181K</w:t>
+              <w:t>403K</w:t>
             </w:r>
           </w:p>
         </w:tc>
@@ -263,7 +263,7 @@
           </w:tcPr>
           <w:p>
             <w:r>
-              <w:t>347K</w:t>
+              <w:t>144K</w:t>
             </w:r>
           </w:p>
         </w:tc>
@@ -273,7 +273,7 @@
           </w:tcPr>
           <w:p>
             <w:r>
-              <w:t>495K</w:t>
+              <w:t>490K</w:t>
             </w:r>
           </w:p>
         </w:tc>
@@ -283,7 +283,7 @@
           </w:tcPr>
           <w:p>
             <w:r>
-              <w:t>218K</w:t>
+              <w:t>367K</w:t>
             </w:r>
           </w:p>
         </w:tc>
@@ -305,7 +305,7 @@
           </w:tcPr>
           <w:p>
             <w:r>
-              <w:t>322K</w:t>
+              <w:t>336K</w:t>
             </w:r>
           </w:p>
         </w:tc>
@@ -315,7 +315,7 @@
           </w:tcPr>
           <w:p>
             <w:r>
-              <w:t>193K</w:t>
+              <w:t>153K</w:t>
             </w:r>
           </w:p>
         </w:tc>
@@ -325,7 +325,7 @@
           </w:tcPr>
           <w:p>
             <w:r>
-              <w:t>149K</w:t>
+              <w:t>299K</w:t>
             </w:r>
           </w:p>
         </w:tc>
@@ -335,7 +335,7 @@
           </w:tcPr>
           <w:p>
             <w:r>
-              <w:t>477K</w:t>
+              <w:t>350K</w:t>
             </w:r>
           </w:p>
         </w:tc>
@@ -357,7 +357,7 @@
           </w:tcPr>
           <w:p>
             <w:r>
-              <w:t>256K</w:t>
+              <w:t>113K</w:t>
             </w:r>
           </w:p>
         </w:tc>
@@ -367,7 +367,7 @@
           </w:tcPr>
           <w:p>
             <w:r>
-              <w:t>176K</w:t>
+              <w:t>368K</w:t>
             </w:r>
           </w:p>
         </w:tc>
@@ -377,7 +377,7 @@
           </w:tcPr>
           <w:p>
             <w:r>
-              <w:t>491K</w:t>
+              <w:t>163K</w:t>
             </w:r>
           </w:p>
         </w:tc>
@@ -387,7 +387,7 @@
           </w:tcPr>
           <w:p>
             <w:r>
-              <w:t>309K</w:t>
+              <w:t>124K</w:t>
             </w:r>
           </w:p>
         </w:tc>
@@ -409,7 +409,7 @@
           </w:tcPr>
           <w:p>
             <w:r>
-              <w:t>496K</w:t>
+              <w:t>220K</w:t>
             </w:r>
           </w:p>
         </w:tc>
@@ -419,7 +419,7 @@
           </w:tcPr>
           <w:p>
             <w:r>
-              <w:t>481K</w:t>
+              <w:t>276K</w:t>
             </w:r>
           </w:p>
         </w:tc>
@@ -429,7 +429,7 @@
           </w:tcPr>
           <w:p>
             <w:r>
-              <w:t>458K</w:t>
+              <w:t>306K</w:t>
             </w:r>
           </w:p>
         </w:tc>
@@ -439,7 +439,7 @@
           </w:tcPr>
           <w:p>
             <w:r>
-              <w:t>217K</w:t>
+              <w:t>417K</w:t>
             </w:r>
           </w:p>
         </w:tc>

</xml_diff>

<commit_message>
feat: add DocumentBuilder.from_template and complete note-reference reconciliation
Adds a one-shot DocumentBuilder.from_template(path) API that bundles the
"correct-at-the-start" pattern observed in metanorma-iso: loads a known-good
DOCX template, resets its body to a clean state, clears user notes (keeping
separators), removes stale image/customXml relationships, and seeds an
IdAllocator from existing rels. This gives downstream users a single-call
path to Word-valid output.

Also completes the note-reference reconciliation (R10) that was partially
merged during rebase: creates missing footnote/endnote definitions for
orphaned references, and adds R15/R16 helpers for stripping invalid note
types and deduplicating note IDs.
</commit_message>
<xml_diff>
--- a/examples/generated/complex_tables.docx
+++ b/examples/generated/complex_tables.docx
@@ -315,7 +315,7 @@
           </w:tcPr>
           <w:p>
             <w:r>
-              <w:t>498K</w:t>
+              <w:t>468K</w:t>
             </w:r>
           </w:p>
         </w:tc>
@@ -326,7 +326,7 @@
           </w:tcPr>
           <w:p>
             <w:r>
-              <w:t>368K</w:t>
+              <w:t>213K</w:t>
             </w:r>
           </w:p>
         </w:tc>
@@ -337,7 +337,7 @@
           </w:tcPr>
           <w:p>
             <w:r>
-              <w:t>164K</w:t>
+              <w:t>450K</w:t>
             </w:r>
           </w:p>
         </w:tc>
@@ -348,7 +348,7 @@
           </w:tcPr>
           <w:p>
             <w:r>
-              <w:t>207K</w:t>
+              <w:t>205K</w:t>
             </w:r>
           </w:p>
         </w:tc>
@@ -372,7 +372,7 @@
           </w:tcPr>
           <w:p>
             <w:r>
-              <w:t>318K</w:t>
+              <w:t>356K</w:t>
             </w:r>
           </w:p>
         </w:tc>
@@ -383,7 +383,7 @@
           </w:tcPr>
           <w:p>
             <w:r>
-              <w:t>378K</w:t>
+              <w:t>186K</w:t>
             </w:r>
           </w:p>
         </w:tc>
@@ -394,7 +394,7 @@
           </w:tcPr>
           <w:p>
             <w:r>
-              <w:t>327K</w:t>
+              <w:t>485K</w:t>
             </w:r>
           </w:p>
         </w:tc>
@@ -405,7 +405,7 @@
           </w:tcPr>
           <w:p>
             <w:r>
-              <w:t>412K</w:t>
+              <w:t>377K</w:t>
             </w:r>
           </w:p>
         </w:tc>
@@ -429,7 +429,7 @@
           </w:tcPr>
           <w:p>
             <w:r>
-              <w:t>243K</w:t>
+              <w:t>123K</w:t>
             </w:r>
           </w:p>
         </w:tc>
@@ -440,7 +440,7 @@
           </w:tcPr>
           <w:p>
             <w:r>
-              <w:t>288K</w:t>
+              <w:t>311K</w:t>
             </w:r>
           </w:p>
         </w:tc>
@@ -451,7 +451,7 @@
           </w:tcPr>
           <w:p>
             <w:r>
-              <w:t>155K</w:t>
+              <w:t>448K</w:t>
             </w:r>
           </w:p>
         </w:tc>
@@ -462,7 +462,7 @@
           </w:tcPr>
           <w:p>
             <w:r>
-              <w:t>295K</w:t>
+              <w:t>351K</w:t>
             </w:r>
           </w:p>
         </w:tc>
@@ -486,7 +486,7 @@
           </w:tcPr>
           <w:p>
             <w:r>
-              <w:t>155K</w:t>
+              <w:t>497K</w:t>
             </w:r>
           </w:p>
         </w:tc>
@@ -497,7 +497,7 @@
           </w:tcPr>
           <w:p>
             <w:r>
-              <w:t>100K</w:t>
+              <w:t>162K</w:t>
             </w:r>
           </w:p>
         </w:tc>
@@ -508,7 +508,7 @@
           </w:tcPr>
           <w:p>
             <w:r>
-              <w:t>206K</w:t>
+              <w:t>181K</w:t>
             </w:r>
           </w:p>
         </w:tc>
@@ -519,7 +519,7 @@
           </w:tcPr>
           <w:p>
             <w:r>
-              <w:t>252K</w:t>
+              <w:t>282K</w:t>
             </w:r>
           </w:p>
         </w:tc>

</xml_diff>

<commit_message>
chore: fix gitignore TODO rule and regenerate fixtures
.gitignore had a bare TODO* rule that incorrectly matched the tracked
TODO.arch-fixes/, TODO.iso-templates/, TODO.new-tasks/, etc. directories.
Replaced with specific /TODO.md and /TODO.txt patterns for personal
scratch files. Added *.bak to ignore sed backup files.

Regenerated example .docx fixtures reflect the new para_id and rsid
values produced by the split-counter fix.
</commit_message>
<xml_diff>
--- a/examples/generated/complex_tables.docx
+++ b/examples/generated/complex_tables.docx
@@ -315,7 +315,7 @@
           </w:tcPr>
           <w:p>
             <w:r>
-              <w:t>468K</w:t>
+              <w:t>193K</w:t>
             </w:r>
           </w:p>
         </w:tc>
@@ -326,7 +326,7 @@
           </w:tcPr>
           <w:p>
             <w:r>
-              <w:t>213K</w:t>
+              <w:t>431K</w:t>
             </w:r>
           </w:p>
         </w:tc>
@@ -337,7 +337,7 @@
           </w:tcPr>
           <w:p>
             <w:r>
-              <w:t>450K</w:t>
+              <w:t>381K</w:t>
             </w:r>
           </w:p>
         </w:tc>
@@ -348,7 +348,7 @@
           </w:tcPr>
           <w:p>
             <w:r>
-              <w:t>205K</w:t>
+              <w:t>139K</w:t>
             </w:r>
           </w:p>
         </w:tc>
@@ -372,7 +372,7 @@
           </w:tcPr>
           <w:p>
             <w:r>
-              <w:t>356K</w:t>
+              <w:t>185K</w:t>
             </w:r>
           </w:p>
         </w:tc>
@@ -383,7 +383,7 @@
           </w:tcPr>
           <w:p>
             <w:r>
-              <w:t>186K</w:t>
+              <w:t>362K</w:t>
             </w:r>
           </w:p>
         </w:tc>
@@ -394,7 +394,7 @@
           </w:tcPr>
           <w:p>
             <w:r>
-              <w:t>485K</w:t>
+              <w:t>422K</w:t>
             </w:r>
           </w:p>
         </w:tc>
@@ -405,7 +405,7 @@
           </w:tcPr>
           <w:p>
             <w:r>
-              <w:t>377K</w:t>
+              <w:t>147K</w:t>
             </w:r>
           </w:p>
         </w:tc>
@@ -429,7 +429,7 @@
           </w:tcPr>
           <w:p>
             <w:r>
-              <w:t>123K</w:t>
+              <w:t>174K</w:t>
             </w:r>
           </w:p>
         </w:tc>
@@ -440,7 +440,7 @@
           </w:tcPr>
           <w:p>
             <w:r>
-              <w:t>311K</w:t>
+              <w:t>269K</w:t>
             </w:r>
           </w:p>
         </w:tc>
@@ -451,7 +451,7 @@
           </w:tcPr>
           <w:p>
             <w:r>
-              <w:t>448K</w:t>
+              <w:t>347K</w:t>
             </w:r>
           </w:p>
         </w:tc>
@@ -462,7 +462,7 @@
           </w:tcPr>
           <w:p>
             <w:r>
-              <w:t>351K</w:t>
+              <w:t>412K</w:t>
             </w:r>
           </w:p>
         </w:tc>
@@ -486,7 +486,7 @@
           </w:tcPr>
           <w:p>
             <w:r>
-              <w:t>497K</w:t>
+              <w:t>157K</w:t>
             </w:r>
           </w:p>
         </w:tc>
@@ -497,7 +497,7 @@
           </w:tcPr>
           <w:p>
             <w:r>
-              <w:t>162K</w:t>
+              <w:t>241K</w:t>
             </w:r>
           </w:p>
         </w:tc>
@@ -508,7 +508,7 @@
           </w:tcPr>
           <w:p>
             <w:r>
-              <w:t>181K</w:t>
+              <w:t>170K</w:t>
             </w:r>
           </w:p>
         </w:tc>
@@ -519,7 +519,7 @@
           </w:tcPr>
           <w:p>
             <w:r>
-              <w:t>282K</w:t>
+              <w:t>273K</w:t>
             </w:r>
           </w:p>
         </w:tc>

</xml_diff>

<commit_message>
chore: consolidate TODOs into single TODO/ dir, ordered by priority+impact
Removed 37 completed TODOs (verified against codebase). Consolidated
12 remaining items from TODO.new-tasks/ and TODO.refactor/ into TODO/
with priority-based numbering:

  01-05: P0-P1 (correctness + forbidden patterns)
  06-10: P2 (architecture debt)
  11:    P3 (test organization)
  12:    P4 (documentation)

AUDIT-2026-05-28.md kept as historical reference.
</commit_message>
<xml_diff>
--- a/examples/generated/complex_tables.docx
+++ b/examples/generated/complex_tables.docx
@@ -315,7 +315,7 @@
           </w:tcPr>
           <w:p>
             <w:r>
-              <w:t>193K</w:t>
+              <w:t>453K</w:t>
             </w:r>
           </w:p>
         </w:tc>
@@ -326,7 +326,7 @@
           </w:tcPr>
           <w:p>
             <w:r>
-              <w:t>431K</w:t>
+              <w:t>213K</w:t>
             </w:r>
           </w:p>
         </w:tc>
@@ -337,7 +337,7 @@
           </w:tcPr>
           <w:p>
             <w:r>
-              <w:t>381K</w:t>
+              <w:t>451K</w:t>
             </w:r>
           </w:p>
         </w:tc>
@@ -348,7 +348,7 @@
           </w:tcPr>
           <w:p>
             <w:r>
-              <w:t>139K</w:t>
+              <w:t>385K</w:t>
             </w:r>
           </w:p>
         </w:tc>
@@ -372,7 +372,7 @@
           </w:tcPr>
           <w:p>
             <w:r>
-              <w:t>185K</w:t>
+              <w:t>412K</w:t>
             </w:r>
           </w:p>
         </w:tc>
@@ -383,7 +383,7 @@
           </w:tcPr>
           <w:p>
             <w:r>
-              <w:t>362K</w:t>
+              <w:t>487K</w:t>
             </w:r>
           </w:p>
         </w:tc>
@@ -394,7 +394,7 @@
           </w:tcPr>
           <w:p>
             <w:r>
-              <w:t>422K</w:t>
+              <w:t>257K</w:t>
             </w:r>
           </w:p>
         </w:tc>
@@ -405,7 +405,7 @@
           </w:tcPr>
           <w:p>
             <w:r>
-              <w:t>147K</w:t>
+              <w:t>397K</w:t>
             </w:r>
           </w:p>
         </w:tc>
@@ -429,7 +429,7 @@
           </w:tcPr>
           <w:p>
             <w:r>
-              <w:t>174K</w:t>
+              <w:t>279K</w:t>
             </w:r>
           </w:p>
         </w:tc>
@@ -440,7 +440,7 @@
           </w:tcPr>
           <w:p>
             <w:r>
-              <w:t>269K</w:t>
+              <w:t>221K</w:t>
             </w:r>
           </w:p>
         </w:tc>
@@ -451,7 +451,7 @@
           </w:tcPr>
           <w:p>
             <w:r>
-              <w:t>347K</w:t>
+              <w:t>104K</w:t>
             </w:r>
           </w:p>
         </w:tc>
@@ -462,7 +462,7 @@
           </w:tcPr>
           <w:p>
             <w:r>
-              <w:t>412K</w:t>
+              <w:t>302K</w:t>
             </w:r>
           </w:p>
         </w:tc>
@@ -486,7 +486,7 @@
           </w:tcPr>
           <w:p>
             <w:r>
-              <w:t>157K</w:t>
+              <w:t>286K</w:t>
             </w:r>
           </w:p>
         </w:tc>
@@ -497,7 +497,7 @@
           </w:tcPr>
           <w:p>
             <w:r>
-              <w:t>241K</w:t>
+              <w:t>459K</w:t>
             </w:r>
           </w:p>
         </w:tc>
@@ -508,7 +508,7 @@
           </w:tcPr>
           <w:p>
             <w:r>
-              <w:t>170K</w:t>
+              <w:t>458K</w:t>
             </w:r>
           </w:p>
         </w:tc>
@@ -519,7 +519,7 @@
           </w:tcPr>
           <w:p>
             <w:r>
-              <w:t>273K</w:t>
+              <w:t>223K</w:t>
             </w:r>
           </w:p>
         </w:tc>

</xml_diff>